<commit_message>
auto(daily): dev loop report 2026-06-10
</commit_message>
<xml_diff>
--- a/reports/hypothesis/2026-06-10.docx
+++ b/reports/hypothesis/2026-06-10.docx
@@ -15,7 +15,7 @@
         <w:rPr>
           <w:i/>
         </w:rPr>
-        <w:t>생성일: 2026-06-10 09:15 KST  |  표본: 측정소당 최소 2388건 / 총 12115건</w:t>
+        <w:t>생성일: 2026-06-10 13:45 KST  |  표본: 측정소당 최소 2393건 / 총 12140건</w:t>
       </w:r>
     </w:p>
     <w:p>
@@ -143,7 +143,7 @@
           </w:tcPr>
           <w:p>
             <w:r>
-              <w:t>37.200</w:t>
+              <w:t>37.181</w:t>
             </w:r>
           </w:p>
         </w:tc>
@@ -153,7 +153,7 @@
           </w:tcPr>
           <w:p>
             <w:r>
-              <w:t>34.081</w:t>
+              <w:t>34.066</w:t>
             </w:r>
           </w:p>
         </w:tc>
@@ -163,7 +163,7 @@
           </w:tcPr>
           <w:p>
             <w:r>
-              <w:t>+3.119</w:t>
+              <w:t>+3.115</w:t>
             </w:r>
           </w:p>
         </w:tc>
@@ -215,7 +215,7 @@
           </w:tcPr>
           <w:p>
             <w:r>
-              <w:t>20.752</w:t>
+              <w:t>20.735</w:t>
             </w:r>
           </w:p>
         </w:tc>
@@ -225,7 +225,7 @@
           </w:tcPr>
           <w:p>
             <w:r>
-              <w:t>17.636</w:t>
+              <w:t>17.629</w:t>
             </w:r>
           </w:p>
         </w:tc>
@@ -235,7 +235,7 @@
           </w:tcPr>
           <w:p>
             <w:r>
-              <w:t>+3.117</w:t>
+              <w:t>+3.106</w:t>
             </w:r>
           </w:p>
         </w:tc>
@@ -265,7 +265,7 @@
           </w:tcPr>
           <w:p>
             <w:r>
-              <w:t>+0.24 (작음)</w:t>
+              <w:t>+0.23 (작음)</w:t>
             </w:r>
           </w:p>
         </w:tc>
@@ -481,7 +481,7 @@
           </w:tcPr>
           <w:p>
             <w:r>
-              <w:t>+0.18 (미미함)</w:t>
+              <w:t>+0.17 (미미함)</w:t>
             </w:r>
           </w:p>
         </w:tc>
@@ -523,7 +523,7 @@
           </w:tcPr>
           <w:p>
             <w:r>
-              <w:t>-0.055</w:t>
+              <w:t>-0.054</w:t>
             </w:r>
           </w:p>
         </w:tc>
@@ -660,7 +660,7 @@
           </w:tcPr>
           <w:p>
             <w:r>
-              <w:t>32.10</w:t>
+              <w:t>32.18</w:t>
             </w:r>
           </w:p>
         </w:tc>
@@ -722,7 +722,7 @@
           </w:tcPr>
           <w:p>
             <w:r>
-              <w:t>78.48</w:t>
+              <w:t>78.43</w:t>
             </w:r>
           </w:p>
         </w:tc>
@@ -752,7 +752,7 @@
           </w:tcPr>
           <w:p>
             <w:r>
-              <w:t>0.027</w:t>
+              <w:t>0.026</w:t>
             </w:r>
           </w:p>
         </w:tc>
@@ -784,7 +784,7 @@
           </w:tcPr>
           <w:p>
             <w:r>
-              <w:t>10.73</w:t>
+              <w:t>10.70</w:t>
             </w:r>
           </w:p>
         </w:tc>
@@ -846,7 +846,7 @@
           </w:tcPr>
           <w:p>
             <w:r>
-              <w:t>154.47</w:t>
+              <w:t>154.60</w:t>
             </w:r>
           </w:p>
         </w:tc>
@@ -908,7 +908,7 @@
           </w:tcPr>
           <w:p>
             <w:r>
-              <w:t>68.99</w:t>
+              <w:t>68.19</w:t>
             </w:r>
           </w:p>
         </w:tc>
@@ -970,7 +970,7 @@
           </w:tcPr>
           <w:p>
             <w:r>
-              <w:t>147.45</w:t>
+              <w:t>146.56</w:t>
             </w:r>
           </w:p>
         </w:tc>
@@ -1029,7 +1029,7 @@
         <w:pStyle w:val="ListBullet"/>
       </w:pPr>
       <w:r>
-        <w:t>'산단 영향군'가 '베이스라인'보다 평균 3.12 높음 (p=0.0000, 효과크기 작음 d=0.24).</w:t>
+        <w:t>'산단 영향군'가 '베이스라인'보다 평균 3.11 높음 (p=0.0000, 효과크기 작음 d=0.23).</w:t>
       </w:r>
     </w:p>
     <w:p>

</xml_diff>